<commit_message>
docs(bd): documentar el blindaje de la PK de USUARIO
- Word: restricciones de USUARIO, corrección C6 y riesgo P1 con sus mitigaciones
- Diccionario de datos y database/README.md con la regla y el procedimiento de corrección
</commit_message>
<xml_diff>
--- a/documents/BD/Modelo_Relacional_3FN_Diagrama_v2.docx
+++ b/documents/BD/Modelo_Relacional_3FN_Diagrama_v2.docx
@@ -1281,6 +1281,60 @@
           <w:szCs w:val="20"/>
         </w:rPr>
         <w:t xml:space="preserve">tipo_identificacion IN (CC, CE, PAS, PPT, NIT)</w:t>
+      </w:r>
+    </w:p>
+    <w:p>
+      <w:pPr>
+        <w:pStyle w:val="ListParagraph"/>
+        <w:numPr>
+          <w:ilvl w:val="0"/>
+          <w:numId w:val="2"/>
+        </w:numPr>
+        <w:spacing w:after="40"/>
+      </w:pPr>
+      <w:r>
+        <w:rPr>
+          <w:rFonts w:ascii="Calibri" w:cs="Calibri" w:eastAsia="Calibri" w:hAnsi="Calibri"/>
+          <w:sz w:val="20"/>
+          <w:szCs w:val="20"/>
+        </w:rPr>
+        <w:t xml:space="preserve">numero_identificacion normalizado: solo mayúsculas y dígitos, sin puntos, guiones ni espacios (CHECK)</w:t>
+      </w:r>
+    </w:p>
+    <w:p>
+      <w:pPr>
+        <w:pStyle w:val="ListParagraph"/>
+        <w:numPr>
+          <w:ilvl w:val="0"/>
+          <w:numId w:val="2"/>
+        </w:numPr>
+        <w:spacing w:after="40"/>
+      </w:pPr>
+      <w:r>
+        <w:rPr>
+          <w:rFonts w:ascii="Calibri" w:cs="Calibri" w:eastAsia="Calibri" w:hAnsi="Calibri"/>
+          <w:sz w:val="20"/>
+          <w:szCs w:val="20"/>
+        </w:rPr>
+        <w:t xml:space="preserve">Formato del número según el tipo: CC 6–10 dígitos; CE 4–10; PPT 5–10; NIT 9–10 (sin dígito de verificación); PAS 5–15 alfanuméricos (CHECK)</w:t>
+      </w:r>
+    </w:p>
+    <w:p>
+      <w:pPr>
+        <w:pStyle w:val="ListParagraph"/>
+        <w:numPr>
+          <w:ilvl w:val="0"/>
+          <w:numId w:val="2"/>
+        </w:numPr>
+        <w:spacing w:after="40"/>
+      </w:pPr>
+      <w:r>
+        <w:rPr>
+          <w:rFonts w:ascii="Calibri" w:cs="Calibri" w:eastAsia="Calibri" w:hAnsi="Calibri"/>
+          <w:sz w:val="20"/>
+          <w:szCs w:val="20"/>
+        </w:rPr>
+        <w:t xml:space="preserve">El documento (numero_identificacion y tipo_identificacion) no se edita salvo corrección explícita (trigger); las FK tienen ON UPDATE CASCADE</w:t>
       </w:r>
     </w:p>
     <w:p>
@@ -7163,6 +7217,95 @@
           </w:p>
         </w:tc>
       </w:tr>
+      <w:tr>
+        <w:tc>
+          <w:tcPr>
+            <w:tcW w:type="dxa" w:w="600"/>
+            <w:tcBorders>
+              <w:top w:val="single" w:color="BFBFBF" w:sz="4"/>
+              <w:left w:val="single" w:color="BFBFBF" w:sz="4"/>
+              <w:bottom w:val="single" w:color="BFBFBF" w:sz="4"/>
+              <w:right w:val="single" w:color="BFBFBF" w:sz="4"/>
+            </w:tcBorders>
+            <w:tcMar>
+              <w:top w:type="dxa" w:w="60"/>
+              <w:left w:type="dxa" w:w="100"/>
+              <w:bottom w:type="dxa" w:w="60"/>
+              <w:right w:type="dxa" w:w="100"/>
+            </w:tcMar>
+          </w:tcPr>
+          <w:p>
+            <w:r>
+              <w:rPr>
+                <w:rFonts w:ascii="Calibri" w:cs="Calibri" w:eastAsia="Calibri" w:hAnsi="Calibri"/>
+                <w:b w:val="false"/>
+                <w:bCs w:val="false"/>
+                <w:sz w:val="18"/>
+                <w:szCs w:val="18"/>
+              </w:rPr>
+              <w:t xml:space="preserve">C6</w:t>
+            </w:r>
+          </w:p>
+        </w:tc>
+        <w:tc>
+          <w:tcPr>
+            <w:tcW w:type="dxa" w:w="3400"/>
+            <w:tcBorders>
+              <w:top w:val="single" w:color="BFBFBF" w:sz="4"/>
+              <w:left w:val="single" w:color="BFBFBF" w:sz="4"/>
+              <w:bottom w:val="single" w:color="BFBFBF" w:sz="4"/>
+              <w:right w:val="single" w:color="BFBFBF" w:sz="4"/>
+            </w:tcBorders>
+            <w:tcMar>
+              <w:top w:type="dxa" w:w="60"/>
+              <w:left w:type="dxa" w:w="100"/>
+              <w:bottom w:type="dxa" w:w="60"/>
+              <w:right w:type="dxa" w:w="100"/>
+            </w:tcMar>
+          </w:tcPr>
+          <w:p>
+            <w:r>
+              <w:rPr>
+                <w:rFonts w:ascii="Calibri" w:cs="Calibri" w:eastAsia="Calibri" w:hAnsi="Calibri"/>
+                <w:b w:val="false"/>
+                <w:bCs w:val="false"/>
+                <w:sz w:val="18"/>
+                <w:szCs w:val="18"/>
+              </w:rPr>
+              <w:t xml:space="preserve">Documento de identidad blindado: formato normalizado y válido por tipo, no editable salvo corrección explícita, ON UPDATE CASCADE en las FK hacia USUARIO y sus subtipos.</w:t>
+            </w:r>
+          </w:p>
+        </w:tc>
+        <w:tc>
+          <w:tcPr>
+            <w:tcW w:type="dxa" w:w="5306"/>
+            <w:tcBorders>
+              <w:top w:val="single" w:color="BFBFBF" w:sz="4"/>
+              <w:left w:val="single" w:color="BFBFBF" w:sz="4"/>
+              <w:bottom w:val="single" w:color="BFBFBF" w:sz="4"/>
+              <w:right w:val="single" w:color="BFBFBF" w:sz="4"/>
+            </w:tcBorders>
+            <w:tcMar>
+              <w:top w:type="dxa" w:w="60"/>
+              <w:left w:type="dxa" w:w="100"/>
+              <w:bottom w:type="dxa" w:w="60"/>
+              <w:right w:type="dxa" w:w="100"/>
+            </w:tcMar>
+          </w:tcPr>
+          <w:p>
+            <w:r>
+              <w:rPr>
+                <w:rFonts w:ascii="Calibri" w:cs="Calibri" w:eastAsia="Calibri" w:hAnsi="Calibri"/>
+                <w:b w:val="false"/>
+                <w:bCs w:val="false"/>
+                <w:sz w:val="18"/>
+                <w:szCs w:val="18"/>
+              </w:rPr>
+              <w:t xml:space="preserve">La PK es solo numero_identificacion; sin estas reglas un dato mal digitado o un formato inválido quedaba como identificador definitivo.</w:t>
+            </w:r>
+          </w:p>
+        </w:tc>
+      </w:tr>
     </w:tbl>
     <w:p>
       <w:pPr>
@@ -7348,7 +7491,7 @@
                 <w:sz w:val="18"/>
                 <w:szCs w:val="18"/>
               </w:rPr>
-              <w:t xml:space="preserve">La PK de USUARIO es numero_identificacion (decisión del equipo).</w:t>
+              <w:t xml:space="preserve">La PK de USUARIO es numero_identificacion (decisión del equipo), blindada en el esquema.</w:t>
             </w:r>
           </w:p>
         </w:tc>
@@ -7377,7 +7520,7 @@
                 <w:sz w:val="18"/>
                 <w:szCs w:val="18"/>
               </w:rPr>
-              <w:t xml:space="preserve">Riesgo conocido: un CC y un CE (o un NIT) con el mismo número no podrían coexistir. Mejoras posibles sin cambiar la PK: CHECK de formato por tipo de documento, número normalizado (sin puntos ni espacios, en mayúsculas), no permitir editar numero_identificacion ni tipo_identificacion, y ON UPDATE CASCADE en las FK por si hay que corregir un dato mal digitado. Alternativas que sí eliminan el riesgo: PK compuesta (tipo_identificacion, numero_identificacion) o clave sustituta id_usuario con UNIQUE (tipo_identificacion, numero_identificacion).</w:t>
+              <w:t xml:space="preserve">Riesgo que se mantiene: un CC y un CE (o un NIT) con el mismo número no pueden coexistir; el segundo registro se rechaza como "documento ya registrado". Mitigaciones aplicadas: número normalizado, formato válido según el tipo, documento no editable salvo corrección explícita (SET LOCAL app.corregir_documento) y ON UPDATE CASCADE en todas las FK. Si algún día el riesgo importa, las alternativas son PK compuesta (tipo_identificacion, numero_identificacion) o clave sustituta id_usuario.</w:t>
             </w:r>
           </w:p>
         </w:tc>
@@ -8018,6 +8161,24 @@
           <w:szCs w:val="20"/>
         </w:rPr>
         <w:t xml:space="preserve">Un EVENTO Cancelado y una RESERVA Cancelada deben tener causa, y la causa debe aplicar al tipo (aplica_a = EVENTO o RESERVA, o AMBOS); si no están cancelados, id_causa es nulo (CHECK + trigger).</w:t>
+      </w:r>
+    </w:p>
+    <w:p>
+      <w:pPr>
+        <w:pStyle w:val="ListParagraph"/>
+        <w:numPr>
+          <w:ilvl w:val="0"/>
+          <w:numId w:val="2"/>
+        </w:numPr>
+        <w:spacing w:after="40"/>
+      </w:pPr>
+      <w:r>
+        <w:rPr>
+          <w:rFonts w:ascii="Calibri" w:cs="Calibri" w:eastAsia="Calibri" w:hAnsi="Calibri"/>
+          <w:sz w:val="20"/>
+          <w:szCs w:val="20"/>
+        </w:rPr>
+        <w:t xml:space="preserve">USUARIO: el número de documento debe estar normalizado y tener el formato de su tipo; no se modifica salvo corrección explícita (trigger), y el cambio se propaga por ON UPDATE CASCADE.</w:t>
       </w:r>
     </w:p>
     <w:p>

</xml_diff>